<commit_message>
coursework: indent first line of every paragraph by two characters (PDF + Word), centre table captions
</commit_message>
<xml_diff>
--- a/coursework/REPORT.docx
+++ b/coursework/REPORT.docx
@@ -472,7 +472,7 @@
       <w:pPr>
         <w:pStyle w:val="FirstParagraph"/>
         <w:spacing w:line="300" w:lineRule="auto" w:before="0" w:after="80"/>
-        <w:ind w:firstLine="0"/>
+        <w:ind w:firstLine="420" w:firstLineChars="200"/>
       </w:pPr>
       <w:r>
         <w:rPr>
@@ -1985,7 +1985,7 @@
       <w:pPr>
         <w:pStyle w:val="FirstParagraph"/>
         <w:spacing w:line="240" w:lineRule="auto" w:before="120" w:after="120"/>
-        <w:ind w:firstLine="0"/>
+        <w:ind w:firstLineChars="200" w:firstLine="0"/>
         <w:jc w:val="center"/>
       </w:pPr>
       <m:oMathPara>
@@ -2276,7 +2276,7 @@
       <w:pPr>
         <w:pStyle w:val="FirstParagraph"/>
         <w:spacing w:line="300" w:lineRule="auto" w:before="0" w:after="80"/>
-        <w:ind w:firstLine="0"/>
+        <w:ind w:firstLine="420" w:firstLineChars="200"/>
       </w:pPr>
       <m:oMath>
         <m:r>
@@ -2452,7 +2452,7 @@
       <w:pPr>
         <w:pStyle w:val="BodyText"/>
         <w:spacing w:line="240" w:lineRule="auto" w:before="120" w:after="120"/>
-        <w:ind w:firstLine="0"/>
+        <w:ind w:firstLineChars="200" w:firstLine="0"/>
         <w:jc w:val="center"/>
       </w:pPr>
       <m:oMathPara>
@@ -2652,7 +2652,7 @@
       <w:pPr>
         <w:pStyle w:val="FirstParagraph"/>
         <w:spacing w:line="300" w:lineRule="auto" w:before="0" w:after="80"/>
-        <w:ind w:firstLine="0"/>
+        <w:ind w:firstLine="420" w:firstLineChars="200"/>
       </w:pPr>
       <w:r>
         <w:rPr>
@@ -2964,7 +2964,7 @@
       <w:pPr>
         <w:pStyle w:val="BodyText"/>
         <w:spacing w:line="300" w:lineRule="auto" w:before="0" w:after="80"/>
-        <w:ind w:firstLine="0"/>
+        <w:ind w:firstLine="420" w:firstLineChars="200"/>
       </w:pPr>
       <w:r>
         <w:rPr>
@@ -2977,7 +2977,7 @@
       <w:pPr>
         <w:pStyle w:val="BodyText"/>
         <w:spacing w:line="240" w:lineRule="auto" w:before="120" w:after="120"/>
-        <w:ind w:firstLine="0"/>
+        <w:ind w:firstLineChars="200" w:firstLine="0"/>
         <w:jc w:val="center"/>
       </w:pPr>
       <m:oMathPara>
@@ -3264,7 +3264,7 @@
       <w:pPr>
         <w:pStyle w:val="FirstParagraph"/>
         <w:spacing w:line="300" w:lineRule="auto" w:before="0" w:after="80"/>
-        <w:ind w:firstLine="0"/>
+        <w:ind w:firstLine="420" w:firstLineChars="200"/>
       </w:pPr>
       <w:r>
         <w:rPr>
@@ -5230,7 +5230,7 @@
       <w:pPr>
         <w:pStyle w:val="BodyText"/>
         <w:spacing w:line="300" w:lineRule="auto" w:before="0" w:after="80"/>
-        <w:ind w:firstLine="0"/>
+        <w:ind w:firstLine="420" w:firstLineChars="200"/>
       </w:pPr>
       <w:r>
         <w:rPr>
@@ -5243,7 +5243,7 @@
       <w:pPr>
         <w:pStyle w:val="BodyText"/>
         <w:spacing w:line="300" w:lineRule="auto" w:before="0" w:after="80"/>
-        <w:ind w:firstLine="0"/>
+        <w:ind w:firstLine="420" w:firstLineChars="200"/>
       </w:pPr>
       <w:r>
         <w:rPr>
@@ -5885,7 +5885,7 @@
       <w:pPr>
         <w:pStyle w:val="BodyText"/>
         <w:spacing w:line="300" w:lineRule="auto" w:before="0" w:after="80"/>
-        <w:ind w:firstLine="0"/>
+        <w:ind w:firstLine="420" w:firstLineChars="200"/>
       </w:pPr>
       <w:r>
         <w:rPr>
@@ -6076,7 +6076,7 @@
       <w:pPr>
         <w:pStyle w:val="BodyText"/>
         <w:spacing w:line="300" w:lineRule="auto" w:before="0" w:after="80"/>
-        <w:ind w:firstLine="0"/>
+        <w:ind w:firstLine="420" w:firstLineChars="200"/>
       </w:pPr>
       <w:r>
         <w:rPr>
@@ -6455,7 +6455,7 @@
         <w:pStyle w:val="ImageCaption"/>
         <w:keepNext/>
         <w:spacing w:before="40" w:after="200"/>
-        <w:ind w:firstLine="0"/>
+        <w:ind/>
         <w:jc w:val="center"/>
       </w:pPr>
       <w:r>
@@ -6486,7 +6486,7 @@
       <w:pPr>
         <w:pStyle w:val="BodyText"/>
         <w:spacing w:line="300" w:lineRule="auto" w:before="0" w:after="80"/>
-        <w:ind w:firstLine="0"/>
+        <w:ind w:firstLine="420" w:firstLineChars="200"/>
       </w:pPr>
       <w:r>
         <w:rPr>
@@ -6972,7 +6972,7 @@
       <w:pPr>
         <w:pStyle w:val="FirstParagraph"/>
         <w:spacing w:line="300" w:lineRule="auto" w:before="0" w:after="80"/>
-        <w:ind w:firstLine="0"/>
+        <w:ind w:firstLine="420" w:firstLineChars="200"/>
       </w:pPr>
       <m:oMath>
         <m:sSub>
@@ -7255,7 +7255,7 @@
       <w:pPr>
         <w:pStyle w:val="BodyText"/>
         <w:spacing w:line="240" w:lineRule="auto" w:before="120" w:after="120"/>
-        <w:ind w:firstLine="0"/>
+        <w:ind w:firstLineChars="200" w:firstLine="0"/>
         <w:jc w:val="center"/>
       </w:pPr>
       <m:oMathPara>
@@ -7420,7 +7420,7 @@
       <w:pPr>
         <w:pStyle w:val="FirstParagraph"/>
         <w:spacing w:line="300" w:lineRule="auto" w:before="0" w:after="80"/>
-        <w:ind w:firstLine="0"/>
+        <w:ind w:firstLine="420" w:firstLineChars="200"/>
       </w:pPr>
       <w:r>
         <w:rPr>
@@ -7558,7 +7558,7 @@
       <w:pPr>
         <w:pStyle w:val="BodyText"/>
         <w:spacing w:line="240" w:lineRule="auto" w:before="120" w:after="120"/>
-        <w:ind w:firstLine="0"/>
+        <w:ind w:firstLineChars="200" w:firstLine="0"/>
         <w:jc w:val="center"/>
       </w:pPr>
       <m:oMathPara>
@@ -7871,7 +7871,7 @@
       <w:pPr>
         <w:pStyle w:val="FirstParagraph"/>
         <w:spacing w:line="300" w:lineRule="auto" w:before="0" w:after="80"/>
-        <w:ind w:firstLine="0"/>
+        <w:ind w:firstLine="420" w:firstLineChars="200"/>
       </w:pPr>
       <m:oMath>
         <m:r>
@@ -8085,7 +8085,7 @@
       <w:pPr>
         <w:pStyle w:val="BodyText"/>
         <w:spacing w:line="240" w:lineRule="auto" w:before="120" w:after="120"/>
-        <w:ind w:firstLine="0"/>
+        <w:ind w:firstLineChars="200" w:firstLine="0"/>
         <w:jc w:val="center"/>
       </w:pPr>
       <m:oMathPara>
@@ -8224,7 +8224,7 @@
       <w:pPr>
         <w:pStyle w:val="FirstParagraph"/>
         <w:spacing w:line="300" w:lineRule="auto" w:before="0" w:after="80"/>
-        <w:ind w:firstLine="0"/>
+        <w:ind w:firstLine="420" w:firstLineChars="200"/>
       </w:pPr>
       <w:r>
         <w:rPr>
@@ -8298,7 +8298,7 @@
       <w:pPr>
         <w:pStyle w:val="BodyText"/>
         <w:spacing w:line="300" w:lineRule="auto" w:before="0" w:after="80"/>
-        <w:ind w:firstLine="0"/>
+        <w:ind w:firstLine="420" w:firstLineChars="200"/>
       </w:pPr>
       <w:r>
         <w:rPr>
@@ -8514,7 +8514,7 @@
       <w:pPr>
         <w:pStyle w:val="BodyText"/>
         <w:spacing w:line="240" w:lineRule="auto" w:before="120" w:after="120"/>
-        <w:ind w:firstLine="0"/>
+        <w:ind w:firstLineChars="200" w:firstLine="0"/>
         <w:jc w:val="center"/>
       </w:pPr>
       <m:oMathPara>
@@ -8705,7 +8705,7 @@
       <w:pPr>
         <w:pStyle w:val="FirstParagraph"/>
         <w:spacing w:line="300" w:lineRule="auto" w:before="0" w:after="80"/>
-        <w:ind w:firstLine="0"/>
+        <w:ind w:firstLine="420" w:firstLineChars="200"/>
       </w:pPr>
       <w:r>
         <w:rPr>
@@ -8940,7 +8940,7 @@
       <w:pPr>
         <w:pStyle w:val="BodyText"/>
         <w:spacing w:line="300" w:lineRule="auto" w:before="0" w:after="80"/>
-        <w:ind w:firstLine="0"/>
+        <w:ind w:firstLine="420" w:firstLineChars="200"/>
       </w:pPr>
       <w:r>
         <w:rPr>
@@ -9155,7 +9155,7 @@
       <w:pPr>
         <w:pStyle w:val="BodyText"/>
         <w:spacing w:line="300" w:lineRule="auto" w:before="0" w:after="80"/>
-        <w:ind w:firstLine="0"/>
+        <w:ind w:firstLine="420" w:firstLineChars="200"/>
       </w:pPr>
       <w:r>
         <w:rPr>
@@ -9266,7 +9266,7 @@
       <w:pPr>
         <w:pStyle w:val="BodyText"/>
         <w:spacing w:line="240" w:lineRule="auto" w:before="120" w:after="120"/>
-        <w:ind w:firstLine="0"/>
+        <w:ind w:firstLineChars="200" w:firstLine="0"/>
         <w:jc w:val="center"/>
       </w:pPr>
       <m:oMathPara>
@@ -9521,7 +9521,7 @@
       <w:pPr>
         <w:pStyle w:val="FirstParagraph"/>
         <w:spacing w:line="300" w:lineRule="auto" w:before="0" w:after="80"/>
-        <w:ind w:firstLine="0"/>
+        <w:ind w:firstLine="420" w:firstLineChars="200"/>
       </w:pPr>
       <w:r>
         <w:rPr>
@@ -9651,7 +9651,7 @@
       <w:pPr>
         <w:pStyle w:val="BodyText"/>
         <w:spacing w:line="240" w:lineRule="auto" w:before="120" w:after="120"/>
-        <w:ind w:firstLine="0"/>
+        <w:ind w:firstLineChars="200" w:firstLine="0"/>
         <w:jc w:val="center"/>
       </w:pPr>
       <m:oMathPara>
@@ -9832,7 +9832,7 @@
       <w:pPr>
         <w:pStyle w:val="FirstParagraph"/>
         <w:spacing w:line="300" w:lineRule="auto" w:before="0" w:after="80"/>
-        <w:ind w:firstLine="0"/>
+        <w:ind w:firstLine="420" w:firstLineChars="200"/>
       </w:pPr>
       <w:r>
         <w:rPr>
@@ -10657,7 +10657,7 @@
         <w:pStyle w:val="BodyText"/>
         <w:keepNext/>
         <w:spacing w:line="300" w:lineRule="auto" w:before="0" w:after="80"/>
-        <w:ind w:firstLine="0"/>
+        <w:ind w:firstLine="420" w:firstLineChars="200"/>
       </w:pPr>
       <w:r>
         <w:rPr>
@@ -11200,7 +11200,7 @@
       <w:pPr>
         <w:pStyle w:val="BodyText"/>
         <w:spacing w:line="300" w:lineRule="auto" w:before="0" w:after="80"/>
-        <w:ind w:firstLine="0"/>
+        <w:ind w:firstLine="420" w:firstLineChars="200"/>
       </w:pPr>
       <m:oMath>
         <m:r>
@@ -11357,7 +11357,7 @@
         <w:pStyle w:val="ImageCaption"/>
         <w:keepNext/>
         <w:spacing w:before="40" w:after="200"/>
-        <w:ind w:firstLine="0"/>
+        <w:ind/>
         <w:jc w:val="center"/>
       </w:pPr>
       <w:r>
@@ -11389,7 +11389,7 @@
       <w:pPr>
         <w:pStyle w:val="BodyText"/>
         <w:spacing w:line="300" w:lineRule="auto" w:before="0" w:after="80"/>
-        <w:ind w:firstLine="0"/>
+        <w:ind w:firstLine="420" w:firstLineChars="200"/>
       </w:pPr>
       <w:r>
         <w:rPr>
@@ -11536,7 +11536,7 @@
       <w:pPr>
         <w:pStyle w:val="BodyText"/>
         <w:spacing w:line="300" w:lineRule="auto" w:before="0" w:after="80"/>
-        <w:ind w:firstLine="0"/>
+        <w:ind w:firstLine="420" w:firstLineChars="200"/>
       </w:pPr>
       <w:r>
         <w:rPr>
@@ -11845,7 +11845,7 @@
       <w:pPr>
         <w:pStyle w:val="BodyText"/>
         <w:spacing w:line="300" w:lineRule="auto" w:before="0" w:after="80"/>
-        <w:ind w:firstLine="0"/>
+        <w:ind w:firstLine="420" w:firstLineChars="200"/>
       </w:pPr>
       <w:r>
         <w:rPr>
@@ -13286,7 +13286,7 @@
       <w:pPr>
         <w:pStyle w:val="BodyText"/>
         <w:spacing w:line="300" w:lineRule="auto" w:before="0" w:after="80"/>
-        <w:ind w:firstLine="0"/>
+        <w:ind w:firstLine="420" w:firstLineChars="200"/>
       </w:pPr>
       <w:r>
         <w:rPr>
@@ -13513,7 +13513,7 @@
       <w:pPr>
         <w:pStyle w:val="FirstParagraph"/>
         <w:spacing w:line="300" w:lineRule="auto" w:before="0" w:after="80"/>
-        <w:ind w:firstLine="0"/>
+        <w:ind w:firstLine="420" w:firstLineChars="200"/>
       </w:pPr>
       <w:r>
         <w:rPr>
@@ -13706,7 +13706,7 @@
         <w:pStyle w:val="BodyText"/>
         <w:keepNext/>
         <w:spacing w:line="300" w:lineRule="auto" w:before="160" w:after="40"/>
-        <w:ind w:left="0" w:right="0" w:firstLine="0"/>
+        <w:ind w:left="0" w:right="0"/>
         <w:jc w:val="center"/>
       </w:pPr>
       <w:r>
@@ -14450,7 +14450,7 @@
         <w:pStyle w:val="BodyText"/>
         <w:keepNext/>
         <w:spacing w:line="300" w:lineRule="auto" w:before="160" w:after="40"/>
-        <w:ind w:left="0" w:right="0" w:firstLine="0"/>
+        <w:ind w:left="0" w:right="0"/>
         <w:jc w:val="center"/>
       </w:pPr>
       <w:r>
@@ -15273,7 +15273,7 @@
         <w:pStyle w:val="ImageCaption"/>
         <w:keepNext/>
         <w:spacing w:before="40" w:after="200"/>
-        <w:ind w:firstLine="0"/>
+        <w:ind/>
         <w:jc w:val="center"/>
       </w:pPr>
       <w:r>
@@ -15305,7 +15305,7 @@
       <w:pPr>
         <w:pStyle w:val="BodyText"/>
         <w:spacing w:line="300" w:lineRule="auto" w:before="0" w:after="80"/>
-        <w:ind w:firstLine="0"/>
+        <w:ind w:firstLine="420" w:firstLineChars="200"/>
       </w:pPr>
       <w:r>
         <w:rPr>
@@ -15563,7 +15563,7 @@
       <w:pPr>
         <w:pStyle w:val="BodyText"/>
         <w:spacing w:line="300" w:lineRule="auto" w:before="0" w:after="80"/>
-        <w:ind w:firstLine="0"/>
+        <w:ind w:firstLine="420" w:firstLineChars="200"/>
       </w:pPr>
       <w:r>
         <w:rPr>
@@ -15699,7 +15699,7 @@
       <w:pPr>
         <w:pStyle w:val="BodyText"/>
         <w:spacing w:line="300" w:lineRule="auto" w:before="0" w:after="80"/>
-        <w:ind w:firstLine="0"/>
+        <w:ind w:firstLine="420" w:firstLineChars="200"/>
       </w:pPr>
       <w:r>
         <w:t xml:space="preserve">COC </w:t>
@@ -16657,7 +16657,7 @@
       <w:pPr>
         <w:pStyle w:val="BodyText"/>
         <w:spacing w:line="300" w:lineRule="auto" w:before="0" w:after="80"/>
-        <w:ind w:firstLine="0"/>
+        <w:ind w:firstLine="420" w:firstLineChars="200"/>
       </w:pPr>
       <w:r>
         <w:rPr>
@@ -16785,7 +16785,7 @@
       <w:pPr>
         <w:pStyle w:val="BodyText"/>
         <w:spacing w:line="240" w:lineRule="auto" w:before="120" w:after="120"/>
-        <w:ind w:firstLine="0"/>
+        <w:ind w:firstLineChars="200" w:firstLine="0"/>
         <w:jc w:val="center"/>
       </w:pPr>
       <m:oMathPara>
@@ -16982,7 +16982,7 @@
       <w:pPr>
         <w:pStyle w:val="FirstParagraph"/>
         <w:spacing w:line="300" w:lineRule="auto" w:before="0" w:after="80"/>
-        <w:ind w:firstLine="0"/>
+        <w:ind w:firstLine="420" w:firstLineChars="200"/>
       </w:pPr>
       <w:r>
         <w:rPr>
@@ -17211,7 +17211,7 @@
         <w:pStyle w:val="FirstParagraph"/>
         <w:keepNext/>
         <w:spacing w:line="300" w:lineRule="auto" w:before="0" w:after="80"/>
-        <w:ind w:firstLine="0"/>
+        <w:ind w:firstLine="420" w:firstLineChars="200"/>
       </w:pPr>
       <w:r>
         <w:rPr>
@@ -17898,7 +17898,7 @@
       <w:pPr>
         <w:pStyle w:val="BodyText"/>
         <w:spacing w:line="300" w:lineRule="auto" w:before="0" w:after="80"/>
-        <w:ind w:firstLine="0"/>
+        <w:ind w:firstLine="420" w:firstLineChars="200"/>
       </w:pPr>
       <w:r>
         <w:rPr>
@@ -18227,7 +18227,7 @@
       <w:pPr>
         <w:pStyle w:val="BodyText"/>
         <w:spacing w:line="300" w:lineRule="auto" w:before="0" w:after="80"/>
-        <w:ind w:firstLine="0"/>
+        <w:ind w:firstLine="420" w:firstLineChars="200"/>
       </w:pPr>
       <w:r>
         <w:rPr>
@@ -18400,7 +18400,7 @@
       <w:pPr>
         <w:pStyle w:val="BodyText"/>
         <w:spacing w:line="300" w:lineRule="auto" w:before="0" w:after="80"/>
-        <w:ind w:firstLine="0"/>
+        <w:ind w:firstLine="420" w:firstLineChars="200"/>
       </w:pPr>
       <w:r>
         <w:t xml:space="preserve">Nesterov </w:t>
@@ -20663,7 +20663,7 @@
         <w:pStyle w:val="ImageCaption"/>
         <w:keepNext/>
         <w:spacing w:before="40" w:after="200"/>
-        <w:ind w:firstLine="0"/>
+        <w:ind/>
         <w:jc w:val="center"/>
       </w:pPr>
       <w:r>
@@ -20721,7 +20721,7 @@
       <w:pPr>
         <w:pStyle w:val="BodyText"/>
         <w:spacing w:line="300" w:lineRule="auto" w:before="0" w:after="80"/>
-        <w:ind w:firstLine="0"/>
+        <w:ind w:firstLine="420" w:firstLineChars="200"/>
       </w:pPr>
       <w:r>
         <w:rPr>
@@ -20993,7 +20993,7 @@
       <w:pPr>
         <w:pStyle w:val="BodyText"/>
         <w:spacing w:line="300" w:lineRule="auto" w:before="0" w:after="80"/>
-        <w:ind w:firstLine="0"/>
+        <w:ind w:firstLine="420" w:firstLineChars="200"/>
       </w:pPr>
       <w:r>
         <w:rPr>
@@ -21209,7 +21209,7 @@
       <w:pPr>
         <w:pStyle w:val="BodyText"/>
         <w:spacing w:line="300" w:lineRule="auto" w:before="0" w:after="80"/>
-        <w:ind w:firstLine="0"/>
+        <w:ind w:firstLine="420" w:firstLineChars="200"/>
       </w:pPr>
       <m:oMath>
         <m:r>
@@ -21449,7 +21449,7 @@
       <w:pPr>
         <w:pStyle w:val="BodyText"/>
         <w:spacing w:line="300" w:lineRule="auto" w:before="0" w:after="80"/>
-        <w:ind w:firstLine="0"/>
+        <w:ind w:firstLine="420" w:firstLineChars="200"/>
       </w:pPr>
       <w:r>
         <w:rPr>
@@ -21751,7 +21751,7 @@
       <w:pPr>
         <w:pStyle w:val="FirstParagraph"/>
         <w:spacing w:line="300" w:lineRule="auto" w:before="0" w:after="80"/>
-        <w:ind w:firstLine="0"/>
+        <w:ind w:firstLine="420" w:firstLineChars="200"/>
       </w:pPr>
       <w:r>
         <w:rPr>
@@ -22010,7 +22010,7 @@
       <w:pPr>
         <w:pStyle w:val="BodyText"/>
         <w:spacing w:line="240" w:lineRule="auto" w:before="120" w:after="120"/>
-        <w:ind w:firstLine="0"/>
+        <w:ind w:firstLineChars="200" w:firstLine="0"/>
         <w:jc w:val="center"/>
       </w:pPr>
       <m:oMathPara>
@@ -22244,7 +22244,7 @@
       <w:pPr>
         <w:pStyle w:val="FirstParagraph"/>
         <w:spacing w:line="300" w:lineRule="auto" w:before="0" w:after="80"/>
-        <w:ind w:firstLine="0"/>
+        <w:ind w:firstLine="420" w:firstLineChars="200"/>
       </w:pPr>
       <w:r>
         <w:rPr>
@@ -22428,7 +22428,7 @@
       <w:pPr>
         <w:pStyle w:val="BodyText"/>
         <w:spacing w:line="300" w:lineRule="auto" w:before="0" w:after="80"/>
-        <w:ind w:firstLine="0"/>
+        <w:ind w:firstLine="420" w:firstLineChars="200"/>
       </w:pPr>
       <w:r>
         <w:rPr>
@@ -22614,7 +22614,7 @@
         <w:pStyle w:val="FirstParagraph"/>
         <w:keepNext/>
         <w:spacing w:line="300" w:lineRule="auto" w:before="160" w:after="40"/>
-        <w:ind w:left="0" w:right="0" w:firstLine="0"/>
+        <w:ind w:left="0" w:right="0"/>
         <w:jc w:val="center"/>
       </w:pPr>
       <w:r>
@@ -23283,7 +23283,7 @@
         <w:pStyle w:val="BodyText"/>
         <w:keepNext/>
         <w:spacing w:line="300" w:lineRule="auto" w:before="160" w:after="40"/>
-        <w:ind w:left="0" w:right="0" w:firstLine="0"/>
+        <w:ind w:left="0" w:right="0"/>
         <w:jc w:val="center"/>
       </w:pPr>
       <w:r>
@@ -23990,7 +23990,7 @@
       <w:pPr>
         <w:pStyle w:val="BodyText"/>
         <w:spacing w:line="300" w:lineRule="auto" w:before="0" w:after="80"/>
-        <w:ind w:firstLine="0"/>
+        <w:ind w:firstLine="420" w:firstLineChars="200"/>
       </w:pPr>
       <w:r>
         <w:t xml:space="preserve">BB </w:t>
@@ -24247,7 +24247,7 @@
         <w:pStyle w:val="ImageCaption"/>
         <w:keepNext/>
         <w:spacing w:before="40" w:after="200"/>
-        <w:ind w:firstLine="0"/>
+        <w:ind/>
         <w:jc w:val="center"/>
       </w:pPr>
       <w:r>
@@ -24279,7 +24279,7 @@
       <w:pPr>
         <w:pStyle w:val="BodyText"/>
         <w:spacing w:line="300" w:lineRule="auto" w:before="0" w:after="80"/>
-        <w:ind w:firstLine="0"/>
+        <w:ind w:firstLine="420" w:firstLineChars="200"/>
       </w:pPr>
       <w:r>
         <w:t xml:space="preserve">BB </w:t>
@@ -24409,7 +24409,7 @@
       <w:pPr>
         <w:pStyle w:val="BodyText"/>
         <w:spacing w:line="300" w:lineRule="auto" w:before="0" w:after="80"/>
-        <w:ind w:firstLine="0"/>
+        <w:ind w:firstLine="420" w:firstLineChars="200"/>
       </w:pPr>
       <m:oMath>
         <m:sSub>
@@ -24790,7 +24790,7 @@
       <w:pPr>
         <w:pStyle w:val="BodyText"/>
         <w:spacing w:line="300" w:lineRule="auto" w:before="0" w:after="80"/>
-        <w:ind w:firstLine="0"/>
+        <w:ind w:firstLine="420" w:firstLineChars="200"/>
       </w:pPr>
       <w:r>
         <w:rPr>
@@ -25056,7 +25056,7 @@
       <w:pPr>
         <w:pStyle w:val="FirstParagraph"/>
         <w:spacing w:line="300" w:lineRule="auto" w:before="0" w:after="80"/>
-        <w:ind w:firstLine="0"/>
+        <w:ind w:firstLine="420" w:firstLineChars="200"/>
       </w:pPr>
       <w:r>
         <w:rPr>
@@ -25867,7 +25867,7 @@
       <w:pPr>
         <w:pStyle w:val="BodyText"/>
         <w:spacing w:line="300" w:lineRule="auto" w:before="0" w:after="80"/>
-        <w:ind w:firstLine="0"/>
+        <w:ind w:firstLine="420" w:firstLineChars="200"/>
       </w:pPr>
       <w:r>
         <w:rPr>
@@ -27003,7 +27003,7 @@
         <w:pStyle w:val="ImageCaption"/>
         <w:keepNext/>
         <w:spacing w:before="40" w:after="200"/>
-        <w:ind w:firstLine="0"/>
+        <w:ind/>
         <w:jc w:val="center"/>
       </w:pPr>
       <w:r>
@@ -27066,7 +27066,7 @@
       <w:pPr>
         <w:pStyle w:val="BodyText"/>
         <w:spacing w:line="300" w:lineRule="auto" w:before="0" w:after="80"/>
-        <w:ind w:firstLine="0"/>
+        <w:ind w:firstLine="420" w:firstLineChars="200"/>
       </w:pPr>
       <w:r>
         <w:rPr>
@@ -27192,7 +27192,7 @@
       <w:pPr>
         <w:pStyle w:val="BodyText"/>
         <w:spacing w:line="300" w:lineRule="auto" w:before="0" w:after="80"/>
-        <w:ind w:firstLine="0"/>
+        <w:ind w:firstLine="420" w:firstLineChars="200"/>
       </w:pPr>
       <w:r>
         <w:t xml:space="preserve">GD </w:t>
@@ -27403,7 +27403,7 @@
       <w:pPr>
         <w:pStyle w:val="BodyText"/>
         <w:spacing w:line="300" w:lineRule="auto" w:before="0" w:after="80"/>
-        <w:ind w:firstLine="0"/>
+        <w:ind w:firstLine="420" w:firstLineChars="200"/>
       </w:pPr>
       <w:r>
         <w:t xml:space="preserve">Heavy Ball </w:t>
@@ -27553,7 +27553,7 @@
       <w:pPr>
         <w:pStyle w:val="BodyText"/>
         <w:spacing w:line="300" w:lineRule="auto" w:before="0" w:after="80"/>
-        <w:ind w:firstLine="0"/>
+        <w:ind w:firstLine="420" w:firstLineChars="200"/>
       </w:pPr>
       <w:r>
         <w:t xml:space="preserve">Nesterov </w:t>
@@ -27944,7 +27944,7 @@
       <w:pPr>
         <w:pStyle w:val="FirstParagraph"/>
         <w:spacing w:line="300" w:lineRule="auto" w:before="0" w:after="80"/>
-        <w:ind w:firstLine="0"/>
+        <w:ind w:firstLine="420" w:firstLineChars="200"/>
       </w:pPr>
       <w:r>
         <w:rPr>
@@ -28054,7 +28054,7 @@
       <w:pPr>
         <w:pStyle w:val="BodyText"/>
         <w:spacing w:line="240" w:lineRule="auto" w:before="120" w:after="120"/>
-        <w:ind w:firstLine="0"/>
+        <w:ind w:firstLineChars="200" w:firstLine="0"/>
         <w:jc w:val="center"/>
       </w:pPr>
       <m:oMathPara>
@@ -28447,7 +28447,7 @@
       <w:pPr>
         <w:pStyle w:val="FirstParagraph"/>
         <w:spacing w:line="300" w:lineRule="auto" w:before="0" w:after="80"/>
-        <w:ind w:firstLine="0"/>
+        <w:ind w:firstLine="420" w:firstLineChars="200"/>
       </w:pPr>
       <w:r>
         <w:rPr>
@@ -28683,7 +28683,7 @@
       <w:pPr>
         <w:pStyle w:val="BodyText"/>
         <w:spacing w:line="240" w:lineRule="auto" w:before="120" w:after="120"/>
-        <w:ind w:firstLine="0"/>
+        <w:ind w:firstLineChars="200" w:firstLine="0"/>
         <w:jc w:val="center"/>
       </w:pPr>
       <m:oMathPara>
@@ -28984,7 +28984,7 @@
       <w:pPr>
         <w:pStyle w:val="FirstParagraph"/>
         <w:spacing w:line="300" w:lineRule="auto" w:before="0" w:after="80"/>
-        <w:ind w:firstLine="0"/>
+        <w:ind w:firstLine="420" w:firstLineChars="200"/>
       </w:pPr>
       <w:r>
         <w:rPr>
@@ -29174,7 +29174,7 @@
       <w:pPr>
         <w:pStyle w:val="BodyText"/>
         <w:spacing w:line="300" w:lineRule="auto" w:before="0" w:after="80"/>
-        <w:ind w:firstLine="0"/>
+        <w:ind w:firstLine="420" w:firstLineChars="200"/>
       </w:pPr>
       <w:r>
         <w:rPr>
@@ -29744,7 +29744,7 @@
       <w:pPr>
         <w:pStyle w:val="FirstParagraph"/>
         <w:spacing w:line="300" w:lineRule="auto" w:before="0" w:after="80"/>
-        <w:ind w:firstLine="0"/>
+        <w:ind w:firstLine="420" w:firstLineChars="200"/>
       </w:pPr>
       <w:r>
         <w:rPr>
@@ -29777,7 +29777,7 @@
       <w:pPr>
         <w:pStyle w:val="BodyText"/>
         <w:spacing w:line="240" w:lineRule="auto" w:before="120" w:after="120"/>
-        <w:ind w:firstLine="0"/>
+        <w:ind w:firstLineChars="200" w:firstLine="0"/>
         <w:jc w:val="center"/>
       </w:pPr>
       <m:oMathPara>
@@ -30056,7 +30056,7 @@
       <w:pPr>
         <w:pStyle w:val="FirstParagraph"/>
         <w:spacing w:line="300" w:lineRule="auto" w:before="0" w:after="80"/>
-        <w:ind w:firstLine="0"/>
+        <w:ind w:firstLine="420" w:firstLineChars="200"/>
       </w:pPr>
       <w:r>
         <w:rPr>
@@ -30329,7 +30329,7 @@
       <w:pPr>
         <w:pStyle w:val="FirstParagraph"/>
         <w:spacing w:line="300" w:lineRule="auto" w:before="0" w:after="80"/>
-        <w:ind w:firstLine="0"/>
+        <w:ind w:firstLine="420" w:firstLineChars="200"/>
       </w:pPr>
       <m:oMath>
         <m:r>
@@ -30433,7 +30433,7 @@
       <w:pPr>
         <w:pStyle w:val="BodyText"/>
         <w:spacing w:line="240" w:lineRule="auto" w:before="120" w:after="120"/>
-        <w:ind w:firstLine="0"/>
+        <w:ind w:firstLineChars="200" w:firstLine="0"/>
         <w:jc w:val="center"/>
       </w:pPr>
       <m:oMathPara>
@@ -30586,7 +30586,7 @@
       <w:pPr>
         <w:pStyle w:val="FirstParagraph"/>
         <w:spacing w:line="300" w:lineRule="auto" w:before="0" w:after="80"/>
-        <w:ind w:firstLine="0"/>
+        <w:ind w:firstLine="420" w:firstLineChars="200"/>
       </w:pPr>
       <w:r>
         <w:rPr>
@@ -30745,7 +30745,7 @@
         <w:pStyle w:val="FirstParagraph"/>
         <w:keepNext/>
         <w:spacing w:line="300" w:lineRule="auto" w:before="0" w:after="80"/>
-        <w:ind w:firstLine="0"/>
+        <w:ind w:firstLine="420" w:firstLineChars="200"/>
       </w:pPr>
       <w:r>
         <w:rPr>
@@ -31683,7 +31683,7 @@
         <w:pStyle w:val="BodyText"/>
         <w:keepNext/>
         <w:spacing w:line="300" w:lineRule="auto" w:before="0" w:after="80"/>
-        <w:ind w:firstLine="0"/>
+        <w:ind w:firstLine="420" w:firstLineChars="200"/>
       </w:pPr>
       <w:r>
         <w:rPr>
@@ -32574,7 +32574,7 @@
       <w:pPr>
         <w:pStyle w:val="BodyText"/>
         <w:spacing w:line="300" w:lineRule="auto" w:before="0" w:after="80"/>
-        <w:ind w:firstLine="0"/>
+        <w:ind w:firstLine="420" w:firstLineChars="200"/>
       </w:pPr>
       <w:r>
         <w:rPr>
@@ -32765,7 +32765,7 @@
         <w:pStyle w:val="ImageCaption"/>
         <w:keepNext/>
         <w:spacing w:before="40" w:after="200"/>
-        <w:ind w:firstLine="0"/>
+        <w:ind/>
         <w:jc w:val="center"/>
       </w:pPr>
       <w:r>
@@ -32806,7 +32806,7 @@
       <w:pPr>
         <w:pStyle w:val="BodyText"/>
         <w:spacing w:line="300" w:lineRule="auto" w:before="0" w:after="80"/>
-        <w:ind w:firstLine="0"/>
+        <w:ind w:firstLine="420" w:firstLineChars="200"/>
       </w:pPr>
       <w:r>
         <w:rPr>
@@ -33399,7 +33399,7 @@
       <w:pPr>
         <w:pStyle w:val="BodyText"/>
         <w:spacing w:line="300" w:lineRule="auto" w:before="0" w:after="80"/>
-        <w:ind w:firstLine="0"/>
+        <w:ind w:firstLine="420" w:firstLineChars="200"/>
       </w:pPr>
       <w:r>
         <w:rPr>
@@ -33598,7 +33598,7 @@
       <w:pPr>
         <w:pStyle w:val="BodyText"/>
         <w:spacing w:line="300" w:lineRule="auto" w:before="0" w:after="80"/>
-        <w:ind w:firstLine="0"/>
+        <w:ind w:firstLine="420" w:firstLineChars="200"/>
       </w:pPr>
       <w:r>
         <w:rPr>
@@ -34338,7 +34338,7 @@
       <w:pPr>
         <w:pStyle w:val="FirstParagraph"/>
         <w:spacing w:line="300" w:lineRule="auto" w:before="0" w:after="80"/>
-        <w:ind w:firstLine="0"/>
+        <w:ind w:firstLine="420" w:firstLineChars="200"/>
       </w:pPr>
       <w:r>
         <w:rPr>
@@ -34461,7 +34461,7 @@
         <w:pStyle w:val="BodyText"/>
         <w:keepNext/>
         <w:spacing w:line="300" w:lineRule="auto" w:before="160" w:after="40"/>
-        <w:ind w:left="0" w:right="0" w:firstLine="0"/>
+        <w:ind w:left="0" w:right="0"/>
         <w:jc w:val="center"/>
       </w:pPr>
       <w:r>
@@ -35293,7 +35293,7 @@
       <w:pPr>
         <w:pStyle w:val="BodyText"/>
         <w:spacing w:line="300" w:lineRule="auto" w:before="0" w:after="80"/>
-        <w:ind w:firstLine="0"/>
+        <w:ind w:firstLine="420" w:firstLineChars="200"/>
       </w:pPr>
       <w:r>
         <w:rPr>
@@ -35438,7 +35438,7 @@
       <w:pPr>
         <w:pStyle w:val="FirstParagraph"/>
         <w:spacing w:line="300" w:lineRule="auto" w:before="0" w:after="80"/>
-        <w:ind w:firstLine="0"/>
+        <w:ind w:firstLine="420" w:firstLineChars="200"/>
       </w:pPr>
       <w:r>
         <w:rPr>
@@ -35746,7 +35746,7 @@
       <w:pPr>
         <w:pStyle w:val="BodyText"/>
         <w:spacing w:line="300" w:lineRule="auto" w:before="0" w:after="80"/>
-        <w:ind w:firstLine="0"/>
+        <w:ind w:firstLine="420" w:firstLineChars="200"/>
       </w:pPr>
       <w:r>
         <w:rPr>
@@ -36076,7 +36076,7 @@
       <w:pPr>
         <w:pStyle w:val="BodyText"/>
         <w:spacing w:line="300" w:lineRule="auto" w:before="0" w:after="80"/>
-        <w:ind w:firstLine="0"/>
+        <w:ind w:firstLine="420" w:firstLineChars="200"/>
       </w:pPr>
       <w:r>
         <w:t xml:space="preserve">CG </w:t>
@@ -36562,7 +36562,7 @@
       <w:pPr>
         <w:pStyle w:val="FirstParagraph"/>
         <w:spacing w:line="300" w:lineRule="auto" w:before="0" w:after="80"/>
-        <w:ind w:firstLine="0"/>
+        <w:ind w:firstLine="420" w:firstLineChars="200"/>
       </w:pPr>
       <w:r>
         <w:rPr>
@@ -36584,7 +36584,7 @@
       <w:pPr>
         <w:pStyle w:val="BodyText"/>
         <w:spacing w:line="300" w:lineRule="auto" w:before="0" w:after="80"/>
-        <w:ind w:firstLine="0"/>
+        <w:ind w:firstLine="420" w:firstLineChars="200"/>
       </w:pPr>
       <w:r>
         <w:rPr>
@@ -36920,7 +36920,7 @@
       <w:pPr>
         <w:pStyle w:val="BodyText"/>
         <w:spacing w:line="300" w:lineRule="auto" w:before="0" w:after="80"/>
-        <w:ind w:firstLine="0"/>
+        <w:ind w:firstLine="420" w:firstLineChars="200"/>
       </w:pPr>
       <w:r>
         <w:rPr>
@@ -37018,7 +37018,7 @@
       <w:pPr>
         <w:pStyle w:val="BodyText"/>
         <w:spacing w:line="300" w:lineRule="auto" w:before="0" w:after="80"/>
-        <w:ind w:firstLine="0"/>
+        <w:ind w:firstLine="420" w:firstLineChars="200"/>
       </w:pPr>
       <w:r>
         <w:rPr>
@@ -38006,7 +38006,7 @@
       <w:pPr>
         <w:pStyle w:val="BodyText"/>
         <w:spacing w:line="300" w:lineRule="auto" w:before="0" w:after="80"/>
-        <w:ind w:firstLine="0"/>
+        <w:ind w:firstLine="420" w:firstLineChars="200"/>
       </w:pPr>
       <w:r>
         <w:rPr>
@@ -38288,7 +38288,7 @@
       <w:pPr>
         <w:pStyle w:val="FirstParagraph"/>
         <w:spacing w:line="300" w:lineRule="auto" w:before="0" w:after="80"/>
-        <w:ind w:firstLine="0"/>
+        <w:ind w:firstLine="420" w:firstLineChars="200"/>
       </w:pPr>
       <w:r>
         <w:rPr>

</xml_diff>